<commit_message>
Adicionar skill code-audit e atualizar Guia de Onboarding v13
</commit_message>
<xml_diff>
--- a/Manual/Guia de Onboarding_Manutençao Dashboard_MAZ_2026_v13.docx
+++ b/Manual/Guia de Onboarding_Manutençao Dashboard_MAZ_2026_v13.docx
@@ -11643,7 +11643,7 @@
     </w:p>
     <w:p>
       <w:r>
-        <w:t>O repositório inclui a skill doc-sync em doc-sync/ pronta para uso com Cowork.</w:t>
+        <w:t>O repositório inclui duas skills em skills/ — doc-sync (Cowork) e code-audit (Claude Code).</w:t>
       </w:r>
     </w:p>
     <w:p>
@@ -11979,7 +11979,7 @@
               <w:t>doc-sync.skill</w:t>
             </w:r>
             <w:r>
-              <w:t xml:space="preserve"> na pasta do projeto (IDG - Relatórios de Análise) e clique em “Save skill” no Claude Cowork.</w:t>
+              <w:t xml:space="preserve"> na subpasta skills\ do projeto e clique em “Save skill” no Claude Cowork.</w:t>
             </w:r>
           </w:p>
         </w:tc>

</xml_diff>

<commit_message>
update doc-sync e guia
</commit_message>
<xml_diff>
--- a/Manual/Guia de Onboarding_Manutençao Dashboard_MAZ_2026_v13.docx
+++ b/Manual/Guia de Onboarding_Manutençao Dashboard_MAZ_2026_v13.docx
@@ -385,7 +385,6 @@
         <w:alias w:val="Índice"/>
         <w:id w:val="1916972987"/>
       </w:sdtPr>
-      <w:sdtEndPr/>
       <w:sdtContent>
         <w:p>
           <w:pPr>
@@ -404,7 +403,11 @@
           </w:pPr>
           <w:r>
             <w:fldChar w:fldCharType="begin"/>
+          </w:r>
+          <w:r>
             <w:instrText>TOC \h \o "1-2" \t "Heading 1,1,Heading 2,2"</w:instrText>
+          </w:r>
+          <w:r>
             <w:fldChar w:fldCharType="separate"/>
           </w:r>
           <w:hyperlink w:anchor="_Toc230360201" w:history="1">
@@ -420,10 +423,40 @@
                 <w:noProof/>
               </w:rPr>
               <w:tab/>
+            </w:r>
+            <w:r>
+              <w:rPr>
+                <w:noProof/>
+              </w:rPr>
               <w:fldChar w:fldCharType="begin"/>
+            </w:r>
+            <w:r>
+              <w:rPr>
+                <w:noProof/>
+              </w:rPr>
               <w:instrText xml:space="preserve"> PAGEREF _Toc230360201 \h </w:instrText>
+            </w:r>
+            <w:r>
+              <w:rPr>
+                <w:noProof/>
+              </w:rPr>
+            </w:r>
+            <w:r>
+              <w:rPr>
+                <w:noProof/>
+              </w:rPr>
               <w:fldChar w:fldCharType="separate"/>
+            </w:r>
+            <w:r>
+              <w:rPr>
+                <w:noProof/>
+              </w:rPr>
               <w:t>2</w:t>
+            </w:r>
+            <w:r>
+              <w:rPr>
+                <w:noProof/>
+              </w:rPr>
               <w:fldChar w:fldCharType="end"/>
             </w:r>
           </w:hyperlink>
@@ -456,10 +489,40 @@
                 <w:noProof/>
               </w:rPr>
               <w:tab/>
+            </w:r>
+            <w:r>
+              <w:rPr>
+                <w:noProof/>
+              </w:rPr>
               <w:fldChar w:fldCharType="begin"/>
+            </w:r>
+            <w:r>
+              <w:rPr>
+                <w:noProof/>
+              </w:rPr>
               <w:instrText xml:space="preserve"> PAGEREF _Toc230360202 \h </w:instrText>
+            </w:r>
+            <w:r>
+              <w:rPr>
+                <w:noProof/>
+              </w:rPr>
+            </w:r>
+            <w:r>
+              <w:rPr>
+                <w:noProof/>
+              </w:rPr>
               <w:fldChar w:fldCharType="separate"/>
+            </w:r>
+            <w:r>
+              <w:rPr>
+                <w:noProof/>
+              </w:rPr>
               <w:t>4</w:t>
+            </w:r>
+            <w:r>
+              <w:rPr>
+                <w:noProof/>
+              </w:rPr>
               <w:fldChar w:fldCharType="end"/>
             </w:r>
           </w:hyperlink>
@@ -492,10 +555,40 @@
                 <w:noProof/>
               </w:rPr>
               <w:tab/>
+            </w:r>
+            <w:r>
+              <w:rPr>
+                <w:noProof/>
+              </w:rPr>
               <w:fldChar w:fldCharType="begin"/>
+            </w:r>
+            <w:r>
+              <w:rPr>
+                <w:noProof/>
+              </w:rPr>
               <w:instrText xml:space="preserve"> PAGEREF _Toc230360203 \h </w:instrText>
+            </w:r>
+            <w:r>
+              <w:rPr>
+                <w:noProof/>
+              </w:rPr>
+            </w:r>
+            <w:r>
+              <w:rPr>
+                <w:noProof/>
+              </w:rPr>
               <w:fldChar w:fldCharType="separate"/>
+            </w:r>
+            <w:r>
+              <w:rPr>
+                <w:noProof/>
+              </w:rPr>
               <w:t>4</w:t>
+            </w:r>
+            <w:r>
+              <w:rPr>
+                <w:noProof/>
+              </w:rPr>
               <w:fldChar w:fldCharType="end"/>
             </w:r>
           </w:hyperlink>
@@ -528,10 +621,40 @@
                 <w:noProof/>
               </w:rPr>
               <w:tab/>
+            </w:r>
+            <w:r>
+              <w:rPr>
+                <w:noProof/>
+              </w:rPr>
               <w:fldChar w:fldCharType="begin"/>
+            </w:r>
+            <w:r>
+              <w:rPr>
+                <w:noProof/>
+              </w:rPr>
               <w:instrText xml:space="preserve"> PAGEREF _Toc230360204 \h </w:instrText>
+            </w:r>
+            <w:r>
+              <w:rPr>
+                <w:noProof/>
+              </w:rPr>
+            </w:r>
+            <w:r>
+              <w:rPr>
+                <w:noProof/>
+              </w:rPr>
               <w:fldChar w:fldCharType="separate"/>
+            </w:r>
+            <w:r>
+              <w:rPr>
+                <w:noProof/>
+              </w:rPr>
               <w:t>5</w:t>
+            </w:r>
+            <w:r>
+              <w:rPr>
+                <w:noProof/>
+              </w:rPr>
               <w:fldChar w:fldCharType="end"/>
             </w:r>
           </w:hyperlink>
@@ -564,10 +687,40 @@
                 <w:noProof/>
               </w:rPr>
               <w:tab/>
+            </w:r>
+            <w:r>
+              <w:rPr>
+                <w:noProof/>
+              </w:rPr>
               <w:fldChar w:fldCharType="begin"/>
+            </w:r>
+            <w:r>
+              <w:rPr>
+                <w:noProof/>
+              </w:rPr>
               <w:instrText xml:space="preserve"> PAGEREF _Toc230360205 \h </w:instrText>
+            </w:r>
+            <w:r>
+              <w:rPr>
+                <w:noProof/>
+              </w:rPr>
+            </w:r>
+            <w:r>
+              <w:rPr>
+                <w:noProof/>
+              </w:rPr>
               <w:fldChar w:fldCharType="separate"/>
+            </w:r>
+            <w:r>
+              <w:rPr>
+                <w:noProof/>
+              </w:rPr>
               <w:t>5</w:t>
+            </w:r>
+            <w:r>
+              <w:rPr>
+                <w:noProof/>
+              </w:rPr>
               <w:fldChar w:fldCharType="end"/>
             </w:r>
           </w:hyperlink>
@@ -600,10 +753,40 @@
                 <w:noProof/>
               </w:rPr>
               <w:tab/>
+            </w:r>
+            <w:r>
+              <w:rPr>
+                <w:noProof/>
+              </w:rPr>
               <w:fldChar w:fldCharType="begin"/>
+            </w:r>
+            <w:r>
+              <w:rPr>
+                <w:noProof/>
+              </w:rPr>
               <w:instrText xml:space="preserve"> PAGEREF _Toc230360206 \h </w:instrText>
+            </w:r>
+            <w:r>
+              <w:rPr>
+                <w:noProof/>
+              </w:rPr>
+            </w:r>
+            <w:r>
+              <w:rPr>
+                <w:noProof/>
+              </w:rPr>
               <w:fldChar w:fldCharType="separate"/>
+            </w:r>
+            <w:r>
+              <w:rPr>
+                <w:noProof/>
+              </w:rPr>
               <w:t>5</w:t>
+            </w:r>
+            <w:r>
+              <w:rPr>
+                <w:noProof/>
+              </w:rPr>
               <w:fldChar w:fldCharType="end"/>
             </w:r>
           </w:hyperlink>
@@ -636,10 +819,40 @@
                 <w:noProof/>
               </w:rPr>
               <w:tab/>
+            </w:r>
+            <w:r>
+              <w:rPr>
+                <w:noProof/>
+              </w:rPr>
               <w:fldChar w:fldCharType="begin"/>
+            </w:r>
+            <w:r>
+              <w:rPr>
+                <w:noProof/>
+              </w:rPr>
               <w:instrText xml:space="preserve"> PAGEREF _Toc230360207 \h </w:instrText>
+            </w:r>
+            <w:r>
+              <w:rPr>
+                <w:noProof/>
+              </w:rPr>
+            </w:r>
+            <w:r>
+              <w:rPr>
+                <w:noProof/>
+              </w:rPr>
               <w:fldChar w:fldCharType="separate"/>
+            </w:r>
+            <w:r>
+              <w:rPr>
+                <w:noProof/>
+              </w:rPr>
               <w:t>5</w:t>
+            </w:r>
+            <w:r>
+              <w:rPr>
+                <w:noProof/>
+              </w:rPr>
               <w:fldChar w:fldCharType="end"/>
             </w:r>
           </w:hyperlink>
@@ -672,10 +885,40 @@
                 <w:noProof/>
               </w:rPr>
               <w:tab/>
+            </w:r>
+            <w:r>
+              <w:rPr>
+                <w:noProof/>
+              </w:rPr>
               <w:fldChar w:fldCharType="begin"/>
+            </w:r>
+            <w:r>
+              <w:rPr>
+                <w:noProof/>
+              </w:rPr>
               <w:instrText xml:space="preserve"> PAGEREF _Toc230360208 \h </w:instrText>
+            </w:r>
+            <w:r>
+              <w:rPr>
+                <w:noProof/>
+              </w:rPr>
+            </w:r>
+            <w:r>
+              <w:rPr>
+                <w:noProof/>
+              </w:rPr>
               <w:fldChar w:fldCharType="separate"/>
+            </w:r>
+            <w:r>
+              <w:rPr>
+                <w:noProof/>
+              </w:rPr>
               <w:t>5</w:t>
+            </w:r>
+            <w:r>
+              <w:rPr>
+                <w:noProof/>
+              </w:rPr>
               <w:fldChar w:fldCharType="end"/>
             </w:r>
           </w:hyperlink>
@@ -708,10 +951,40 @@
                 <w:noProof/>
               </w:rPr>
               <w:tab/>
+            </w:r>
+            <w:r>
+              <w:rPr>
+                <w:noProof/>
+              </w:rPr>
               <w:fldChar w:fldCharType="begin"/>
+            </w:r>
+            <w:r>
+              <w:rPr>
+                <w:noProof/>
+              </w:rPr>
               <w:instrText xml:space="preserve"> PAGEREF _Toc230360209 \h </w:instrText>
+            </w:r>
+            <w:r>
+              <w:rPr>
+                <w:noProof/>
+              </w:rPr>
+            </w:r>
+            <w:r>
+              <w:rPr>
+                <w:noProof/>
+              </w:rPr>
               <w:fldChar w:fldCharType="separate"/>
+            </w:r>
+            <w:r>
+              <w:rPr>
+                <w:noProof/>
+              </w:rPr>
               <w:t>7</w:t>
+            </w:r>
+            <w:r>
+              <w:rPr>
+                <w:noProof/>
+              </w:rPr>
               <w:fldChar w:fldCharType="end"/>
             </w:r>
           </w:hyperlink>
@@ -744,10 +1017,40 @@
                 <w:noProof/>
               </w:rPr>
               <w:tab/>
+            </w:r>
+            <w:r>
+              <w:rPr>
+                <w:noProof/>
+              </w:rPr>
               <w:fldChar w:fldCharType="begin"/>
+            </w:r>
+            <w:r>
+              <w:rPr>
+                <w:noProof/>
+              </w:rPr>
               <w:instrText xml:space="preserve"> PAGEREF _Toc230360210 \h </w:instrText>
+            </w:r>
+            <w:r>
+              <w:rPr>
+                <w:noProof/>
+              </w:rPr>
+            </w:r>
+            <w:r>
+              <w:rPr>
+                <w:noProof/>
+              </w:rPr>
               <w:fldChar w:fldCharType="separate"/>
+            </w:r>
+            <w:r>
+              <w:rPr>
+                <w:noProof/>
+              </w:rPr>
               <w:t>7</w:t>
+            </w:r>
+            <w:r>
+              <w:rPr>
+                <w:noProof/>
+              </w:rPr>
               <w:fldChar w:fldCharType="end"/>
             </w:r>
           </w:hyperlink>
@@ -780,10 +1083,40 @@
                 <w:noProof/>
               </w:rPr>
               <w:tab/>
+            </w:r>
+            <w:r>
+              <w:rPr>
+                <w:noProof/>
+              </w:rPr>
               <w:fldChar w:fldCharType="begin"/>
+            </w:r>
+            <w:r>
+              <w:rPr>
+                <w:noProof/>
+              </w:rPr>
               <w:instrText xml:space="preserve"> PAGEREF _Toc230360211 \h </w:instrText>
+            </w:r>
+            <w:r>
+              <w:rPr>
+                <w:noProof/>
+              </w:rPr>
+            </w:r>
+            <w:r>
+              <w:rPr>
+                <w:noProof/>
+              </w:rPr>
               <w:fldChar w:fldCharType="separate"/>
+            </w:r>
+            <w:r>
+              <w:rPr>
+                <w:noProof/>
+              </w:rPr>
               <w:t>7</w:t>
+            </w:r>
+            <w:r>
+              <w:rPr>
+                <w:noProof/>
+              </w:rPr>
               <w:fldChar w:fldCharType="end"/>
             </w:r>
           </w:hyperlink>
@@ -816,10 +1149,40 @@
                 <w:noProof/>
               </w:rPr>
               <w:tab/>
+            </w:r>
+            <w:r>
+              <w:rPr>
+                <w:noProof/>
+              </w:rPr>
               <w:fldChar w:fldCharType="begin"/>
+            </w:r>
+            <w:r>
+              <w:rPr>
+                <w:noProof/>
+              </w:rPr>
               <w:instrText xml:space="preserve"> PAGEREF _Toc230360212 \h </w:instrText>
+            </w:r>
+            <w:r>
+              <w:rPr>
+                <w:noProof/>
+              </w:rPr>
+            </w:r>
+            <w:r>
+              <w:rPr>
+                <w:noProof/>
+              </w:rPr>
               <w:fldChar w:fldCharType="separate"/>
+            </w:r>
+            <w:r>
+              <w:rPr>
+                <w:noProof/>
+              </w:rPr>
               <w:t>7</w:t>
+            </w:r>
+            <w:r>
+              <w:rPr>
+                <w:noProof/>
+              </w:rPr>
               <w:fldChar w:fldCharType="end"/>
             </w:r>
           </w:hyperlink>
@@ -852,10 +1215,40 @@
                 <w:noProof/>
               </w:rPr>
               <w:tab/>
+            </w:r>
+            <w:r>
+              <w:rPr>
+                <w:noProof/>
+              </w:rPr>
               <w:fldChar w:fldCharType="begin"/>
+            </w:r>
+            <w:r>
+              <w:rPr>
+                <w:noProof/>
+              </w:rPr>
               <w:instrText xml:space="preserve"> PAGEREF _Toc230360213 \h </w:instrText>
+            </w:r>
+            <w:r>
+              <w:rPr>
+                <w:noProof/>
+              </w:rPr>
+            </w:r>
+            <w:r>
+              <w:rPr>
+                <w:noProof/>
+              </w:rPr>
               <w:fldChar w:fldCharType="separate"/>
+            </w:r>
+            <w:r>
+              <w:rPr>
+                <w:noProof/>
+              </w:rPr>
               <w:t>7</w:t>
+            </w:r>
+            <w:r>
+              <w:rPr>
+                <w:noProof/>
+              </w:rPr>
               <w:fldChar w:fldCharType="end"/>
             </w:r>
           </w:hyperlink>
@@ -888,10 +1281,40 @@
                 <w:noProof/>
               </w:rPr>
               <w:tab/>
+            </w:r>
+            <w:r>
+              <w:rPr>
+                <w:noProof/>
+              </w:rPr>
               <w:fldChar w:fldCharType="begin"/>
+            </w:r>
+            <w:r>
+              <w:rPr>
+                <w:noProof/>
+              </w:rPr>
               <w:instrText xml:space="preserve"> PAGEREF _Toc230360214 \h </w:instrText>
+            </w:r>
+            <w:r>
+              <w:rPr>
+                <w:noProof/>
+              </w:rPr>
+            </w:r>
+            <w:r>
+              <w:rPr>
+                <w:noProof/>
+              </w:rPr>
               <w:fldChar w:fldCharType="separate"/>
+            </w:r>
+            <w:r>
+              <w:rPr>
+                <w:noProof/>
+              </w:rPr>
               <w:t>8</w:t>
+            </w:r>
+            <w:r>
+              <w:rPr>
+                <w:noProof/>
+              </w:rPr>
               <w:fldChar w:fldCharType="end"/>
             </w:r>
           </w:hyperlink>
@@ -924,10 +1347,40 @@
                 <w:noProof/>
               </w:rPr>
               <w:tab/>
+            </w:r>
+            <w:r>
+              <w:rPr>
+                <w:noProof/>
+              </w:rPr>
               <w:fldChar w:fldCharType="begin"/>
+            </w:r>
+            <w:r>
+              <w:rPr>
+                <w:noProof/>
+              </w:rPr>
               <w:instrText xml:space="preserve"> PAGEREF _Toc230360215 \h </w:instrText>
+            </w:r>
+            <w:r>
+              <w:rPr>
+                <w:noProof/>
+              </w:rPr>
+            </w:r>
+            <w:r>
+              <w:rPr>
+                <w:noProof/>
+              </w:rPr>
               <w:fldChar w:fldCharType="separate"/>
+            </w:r>
+            <w:r>
+              <w:rPr>
+                <w:noProof/>
+              </w:rPr>
               <w:t>8</w:t>
+            </w:r>
+            <w:r>
+              <w:rPr>
+                <w:noProof/>
+              </w:rPr>
               <w:fldChar w:fldCharType="end"/>
             </w:r>
           </w:hyperlink>
@@ -960,10 +1413,40 @@
                 <w:noProof/>
               </w:rPr>
               <w:tab/>
+            </w:r>
+            <w:r>
+              <w:rPr>
+                <w:noProof/>
+              </w:rPr>
               <w:fldChar w:fldCharType="begin"/>
+            </w:r>
+            <w:r>
+              <w:rPr>
+                <w:noProof/>
+              </w:rPr>
               <w:instrText xml:space="preserve"> PAGEREF _Toc230360216 \h </w:instrText>
+            </w:r>
+            <w:r>
+              <w:rPr>
+                <w:noProof/>
+              </w:rPr>
+            </w:r>
+            <w:r>
+              <w:rPr>
+                <w:noProof/>
+              </w:rPr>
               <w:fldChar w:fldCharType="separate"/>
+            </w:r>
+            <w:r>
+              <w:rPr>
+                <w:noProof/>
+              </w:rPr>
               <w:t>8</w:t>
+            </w:r>
+            <w:r>
+              <w:rPr>
+                <w:noProof/>
+              </w:rPr>
               <w:fldChar w:fldCharType="end"/>
             </w:r>
           </w:hyperlink>
@@ -996,10 +1479,40 @@
                 <w:noProof/>
               </w:rPr>
               <w:tab/>
+            </w:r>
+            <w:r>
+              <w:rPr>
+                <w:noProof/>
+              </w:rPr>
               <w:fldChar w:fldCharType="begin"/>
+            </w:r>
+            <w:r>
+              <w:rPr>
+                <w:noProof/>
+              </w:rPr>
               <w:instrText xml:space="preserve"> PAGEREF _Toc230360217 \h </w:instrText>
+            </w:r>
+            <w:r>
+              <w:rPr>
+                <w:noProof/>
+              </w:rPr>
+            </w:r>
+            <w:r>
+              <w:rPr>
+                <w:noProof/>
+              </w:rPr>
               <w:fldChar w:fldCharType="separate"/>
+            </w:r>
+            <w:r>
+              <w:rPr>
+                <w:noProof/>
+              </w:rPr>
               <w:t>8</w:t>
+            </w:r>
+            <w:r>
+              <w:rPr>
+                <w:noProof/>
+              </w:rPr>
               <w:fldChar w:fldCharType="end"/>
             </w:r>
           </w:hyperlink>
@@ -1032,10 +1545,40 @@
                 <w:noProof/>
               </w:rPr>
               <w:tab/>
+            </w:r>
+            <w:r>
+              <w:rPr>
+                <w:noProof/>
+              </w:rPr>
               <w:fldChar w:fldCharType="begin"/>
+            </w:r>
+            <w:r>
+              <w:rPr>
+                <w:noProof/>
+              </w:rPr>
               <w:instrText xml:space="preserve"> PAGEREF _Toc230360218 \h </w:instrText>
+            </w:r>
+            <w:r>
+              <w:rPr>
+                <w:noProof/>
+              </w:rPr>
+            </w:r>
+            <w:r>
+              <w:rPr>
+                <w:noProof/>
+              </w:rPr>
               <w:fldChar w:fldCharType="separate"/>
+            </w:r>
+            <w:r>
+              <w:rPr>
+                <w:noProof/>
+              </w:rPr>
               <w:t>9</w:t>
+            </w:r>
+            <w:r>
+              <w:rPr>
+                <w:noProof/>
+              </w:rPr>
               <w:fldChar w:fldCharType="end"/>
             </w:r>
           </w:hyperlink>
@@ -1068,10 +1611,40 @@
                 <w:noProof/>
               </w:rPr>
               <w:tab/>
+            </w:r>
+            <w:r>
+              <w:rPr>
+                <w:noProof/>
+              </w:rPr>
               <w:fldChar w:fldCharType="begin"/>
+            </w:r>
+            <w:r>
+              <w:rPr>
+                <w:noProof/>
+              </w:rPr>
               <w:instrText xml:space="preserve"> PAGEREF _Toc230360219 \h </w:instrText>
+            </w:r>
+            <w:r>
+              <w:rPr>
+                <w:noProof/>
+              </w:rPr>
+            </w:r>
+            <w:r>
+              <w:rPr>
+                <w:noProof/>
+              </w:rPr>
               <w:fldChar w:fldCharType="separate"/>
+            </w:r>
+            <w:r>
+              <w:rPr>
+                <w:noProof/>
+              </w:rPr>
               <w:t>9</w:t>
+            </w:r>
+            <w:r>
+              <w:rPr>
+                <w:noProof/>
+              </w:rPr>
               <w:fldChar w:fldCharType="end"/>
             </w:r>
           </w:hyperlink>
@@ -1104,10 +1677,40 @@
                 <w:noProof/>
               </w:rPr>
               <w:tab/>
+            </w:r>
+            <w:r>
+              <w:rPr>
+                <w:noProof/>
+              </w:rPr>
               <w:fldChar w:fldCharType="begin"/>
+            </w:r>
+            <w:r>
+              <w:rPr>
+                <w:noProof/>
+              </w:rPr>
               <w:instrText xml:space="preserve"> PAGEREF _Toc230360220 \h </w:instrText>
+            </w:r>
+            <w:r>
+              <w:rPr>
+                <w:noProof/>
+              </w:rPr>
+            </w:r>
+            <w:r>
+              <w:rPr>
+                <w:noProof/>
+              </w:rPr>
               <w:fldChar w:fldCharType="separate"/>
+            </w:r>
+            <w:r>
+              <w:rPr>
+                <w:noProof/>
+              </w:rPr>
               <w:t>9</w:t>
+            </w:r>
+            <w:r>
+              <w:rPr>
+                <w:noProof/>
+              </w:rPr>
               <w:fldChar w:fldCharType="end"/>
             </w:r>
           </w:hyperlink>
@@ -1140,10 +1743,40 @@
                 <w:noProof/>
               </w:rPr>
               <w:tab/>
+            </w:r>
+            <w:r>
+              <w:rPr>
+                <w:noProof/>
+              </w:rPr>
               <w:fldChar w:fldCharType="begin"/>
+            </w:r>
+            <w:r>
+              <w:rPr>
+                <w:noProof/>
+              </w:rPr>
               <w:instrText xml:space="preserve"> PAGEREF _Toc230360221 \h </w:instrText>
+            </w:r>
+            <w:r>
+              <w:rPr>
+                <w:noProof/>
+              </w:rPr>
+            </w:r>
+            <w:r>
+              <w:rPr>
+                <w:noProof/>
+              </w:rPr>
               <w:fldChar w:fldCharType="separate"/>
+            </w:r>
+            <w:r>
+              <w:rPr>
+                <w:noProof/>
+              </w:rPr>
               <w:t>9</w:t>
+            </w:r>
+            <w:r>
+              <w:rPr>
+                <w:noProof/>
+              </w:rPr>
               <w:fldChar w:fldCharType="end"/>
             </w:r>
           </w:hyperlink>
@@ -1176,10 +1809,40 @@
                 <w:noProof/>
               </w:rPr>
               <w:tab/>
+            </w:r>
+            <w:r>
+              <w:rPr>
+                <w:noProof/>
+              </w:rPr>
               <w:fldChar w:fldCharType="begin"/>
+            </w:r>
+            <w:r>
+              <w:rPr>
+                <w:noProof/>
+              </w:rPr>
               <w:instrText xml:space="preserve"> PAGEREF _Toc230360222 \h </w:instrText>
+            </w:r>
+            <w:r>
+              <w:rPr>
+                <w:noProof/>
+              </w:rPr>
+            </w:r>
+            <w:r>
+              <w:rPr>
+                <w:noProof/>
+              </w:rPr>
               <w:fldChar w:fldCharType="separate"/>
+            </w:r>
+            <w:r>
+              <w:rPr>
+                <w:noProof/>
+              </w:rPr>
               <w:t>9</w:t>
+            </w:r>
+            <w:r>
+              <w:rPr>
+                <w:noProof/>
+              </w:rPr>
               <w:fldChar w:fldCharType="end"/>
             </w:r>
           </w:hyperlink>
@@ -1212,10 +1875,40 @@
                 <w:noProof/>
               </w:rPr>
               <w:tab/>
+            </w:r>
+            <w:r>
+              <w:rPr>
+                <w:noProof/>
+              </w:rPr>
               <w:fldChar w:fldCharType="begin"/>
+            </w:r>
+            <w:r>
+              <w:rPr>
+                <w:noProof/>
+              </w:rPr>
               <w:instrText xml:space="preserve"> PAGEREF _Toc230360223 \h </w:instrText>
+            </w:r>
+            <w:r>
+              <w:rPr>
+                <w:noProof/>
+              </w:rPr>
+            </w:r>
+            <w:r>
+              <w:rPr>
+                <w:noProof/>
+              </w:rPr>
               <w:fldChar w:fldCharType="separate"/>
+            </w:r>
+            <w:r>
+              <w:rPr>
+                <w:noProof/>
+              </w:rPr>
               <w:t>11</w:t>
+            </w:r>
+            <w:r>
+              <w:rPr>
+                <w:noProof/>
+              </w:rPr>
               <w:fldChar w:fldCharType="end"/>
             </w:r>
           </w:hyperlink>
@@ -1248,10 +1941,40 @@
                 <w:noProof/>
               </w:rPr>
               <w:tab/>
+            </w:r>
+            <w:r>
+              <w:rPr>
+                <w:noProof/>
+              </w:rPr>
               <w:fldChar w:fldCharType="begin"/>
+            </w:r>
+            <w:r>
+              <w:rPr>
+                <w:noProof/>
+              </w:rPr>
               <w:instrText xml:space="preserve"> PAGEREF _Toc230360224 \h </w:instrText>
+            </w:r>
+            <w:r>
+              <w:rPr>
+                <w:noProof/>
+              </w:rPr>
+            </w:r>
+            <w:r>
+              <w:rPr>
+                <w:noProof/>
+              </w:rPr>
               <w:fldChar w:fldCharType="separate"/>
+            </w:r>
+            <w:r>
+              <w:rPr>
+                <w:noProof/>
+              </w:rPr>
               <w:t>11</w:t>
+            </w:r>
+            <w:r>
+              <w:rPr>
+                <w:noProof/>
+              </w:rPr>
               <w:fldChar w:fldCharType="end"/>
             </w:r>
           </w:hyperlink>
@@ -1284,10 +2007,40 @@
                 <w:noProof/>
               </w:rPr>
               <w:tab/>
+            </w:r>
+            <w:r>
+              <w:rPr>
+                <w:noProof/>
+              </w:rPr>
               <w:fldChar w:fldCharType="begin"/>
+            </w:r>
+            <w:r>
+              <w:rPr>
+                <w:noProof/>
+              </w:rPr>
               <w:instrText xml:space="preserve"> PAGEREF _Toc230360225 \h </w:instrText>
+            </w:r>
+            <w:r>
+              <w:rPr>
+                <w:noProof/>
+              </w:rPr>
+            </w:r>
+            <w:r>
+              <w:rPr>
+                <w:noProof/>
+              </w:rPr>
               <w:fldChar w:fldCharType="separate"/>
+            </w:r>
+            <w:r>
+              <w:rPr>
+                <w:noProof/>
+              </w:rPr>
               <w:t>11</w:t>
+            </w:r>
+            <w:r>
+              <w:rPr>
+                <w:noProof/>
+              </w:rPr>
               <w:fldChar w:fldCharType="end"/>
             </w:r>
           </w:hyperlink>
@@ -1320,10 +2073,40 @@
                 <w:noProof/>
               </w:rPr>
               <w:tab/>
+            </w:r>
+            <w:r>
+              <w:rPr>
+                <w:noProof/>
+              </w:rPr>
               <w:fldChar w:fldCharType="begin"/>
+            </w:r>
+            <w:r>
+              <w:rPr>
+                <w:noProof/>
+              </w:rPr>
               <w:instrText xml:space="preserve"> PAGEREF _Toc230360226 \h </w:instrText>
+            </w:r>
+            <w:r>
+              <w:rPr>
+                <w:noProof/>
+              </w:rPr>
+            </w:r>
+            <w:r>
+              <w:rPr>
+                <w:noProof/>
+              </w:rPr>
               <w:fldChar w:fldCharType="separate"/>
+            </w:r>
+            <w:r>
+              <w:rPr>
+                <w:noProof/>
+              </w:rPr>
               <w:t>12</w:t>
+            </w:r>
+            <w:r>
+              <w:rPr>
+                <w:noProof/>
+              </w:rPr>
               <w:fldChar w:fldCharType="end"/>
             </w:r>
           </w:hyperlink>
@@ -1356,10 +2139,40 @@
                 <w:noProof/>
               </w:rPr>
               <w:tab/>
+            </w:r>
+            <w:r>
+              <w:rPr>
+                <w:noProof/>
+              </w:rPr>
               <w:fldChar w:fldCharType="begin"/>
+            </w:r>
+            <w:r>
+              <w:rPr>
+                <w:noProof/>
+              </w:rPr>
               <w:instrText xml:space="preserve"> PAGEREF _Toc230360227 \h </w:instrText>
+            </w:r>
+            <w:r>
+              <w:rPr>
+                <w:noProof/>
+              </w:rPr>
+            </w:r>
+            <w:r>
+              <w:rPr>
+                <w:noProof/>
+              </w:rPr>
               <w:fldChar w:fldCharType="separate"/>
+            </w:r>
+            <w:r>
+              <w:rPr>
+                <w:noProof/>
+              </w:rPr>
               <w:t>12</w:t>
+            </w:r>
+            <w:r>
+              <w:rPr>
+                <w:noProof/>
+              </w:rPr>
               <w:fldChar w:fldCharType="end"/>
             </w:r>
           </w:hyperlink>
@@ -1392,10 +2205,40 @@
                 <w:noProof/>
               </w:rPr>
               <w:tab/>
+            </w:r>
+            <w:r>
+              <w:rPr>
+                <w:noProof/>
+              </w:rPr>
               <w:fldChar w:fldCharType="begin"/>
+            </w:r>
+            <w:r>
+              <w:rPr>
+                <w:noProof/>
+              </w:rPr>
               <w:instrText xml:space="preserve"> PAGEREF _Toc230360228 \h </w:instrText>
+            </w:r>
+            <w:r>
+              <w:rPr>
+                <w:noProof/>
+              </w:rPr>
+            </w:r>
+            <w:r>
+              <w:rPr>
+                <w:noProof/>
+              </w:rPr>
               <w:fldChar w:fldCharType="separate"/>
+            </w:r>
+            <w:r>
+              <w:rPr>
+                <w:noProof/>
+              </w:rPr>
               <w:t>12</w:t>
+            </w:r>
+            <w:r>
+              <w:rPr>
+                <w:noProof/>
+              </w:rPr>
               <w:fldChar w:fldCharType="end"/>
             </w:r>
           </w:hyperlink>
@@ -1428,10 +2271,40 @@
                 <w:noProof/>
               </w:rPr>
               <w:tab/>
+            </w:r>
+            <w:r>
+              <w:rPr>
+                <w:noProof/>
+              </w:rPr>
               <w:fldChar w:fldCharType="begin"/>
+            </w:r>
+            <w:r>
+              <w:rPr>
+                <w:noProof/>
+              </w:rPr>
               <w:instrText xml:space="preserve"> PAGEREF _Toc230360229 \h </w:instrText>
+            </w:r>
+            <w:r>
+              <w:rPr>
+                <w:noProof/>
+              </w:rPr>
+            </w:r>
+            <w:r>
+              <w:rPr>
+                <w:noProof/>
+              </w:rPr>
               <w:fldChar w:fldCharType="separate"/>
+            </w:r>
+            <w:r>
+              <w:rPr>
+                <w:noProof/>
+              </w:rPr>
               <w:t>12</w:t>
+            </w:r>
+            <w:r>
+              <w:rPr>
+                <w:noProof/>
+              </w:rPr>
               <w:fldChar w:fldCharType="end"/>
             </w:r>
           </w:hyperlink>
@@ -1464,10 +2337,40 @@
                 <w:noProof/>
               </w:rPr>
               <w:tab/>
+            </w:r>
+            <w:r>
+              <w:rPr>
+                <w:noProof/>
+              </w:rPr>
               <w:fldChar w:fldCharType="begin"/>
+            </w:r>
+            <w:r>
+              <w:rPr>
+                <w:noProof/>
+              </w:rPr>
               <w:instrText xml:space="preserve"> PAGEREF _Toc230360230 \h </w:instrText>
+            </w:r>
+            <w:r>
+              <w:rPr>
+                <w:noProof/>
+              </w:rPr>
+            </w:r>
+            <w:r>
+              <w:rPr>
+                <w:noProof/>
+              </w:rPr>
               <w:fldChar w:fldCharType="separate"/>
+            </w:r>
+            <w:r>
+              <w:rPr>
+                <w:noProof/>
+              </w:rPr>
               <w:t>12</w:t>
+            </w:r>
+            <w:r>
+              <w:rPr>
+                <w:noProof/>
+              </w:rPr>
               <w:fldChar w:fldCharType="end"/>
             </w:r>
           </w:hyperlink>
@@ -1500,10 +2403,40 @@
                 <w:noProof/>
               </w:rPr>
               <w:tab/>
+            </w:r>
+            <w:r>
+              <w:rPr>
+                <w:noProof/>
+              </w:rPr>
               <w:fldChar w:fldCharType="begin"/>
+            </w:r>
+            <w:r>
+              <w:rPr>
+                <w:noProof/>
+              </w:rPr>
               <w:instrText xml:space="preserve"> PAGEREF _Toc230360231 \h </w:instrText>
+            </w:r>
+            <w:r>
+              <w:rPr>
+                <w:noProof/>
+              </w:rPr>
+            </w:r>
+            <w:r>
+              <w:rPr>
+                <w:noProof/>
+              </w:rPr>
               <w:fldChar w:fldCharType="separate"/>
+            </w:r>
+            <w:r>
+              <w:rPr>
+                <w:noProof/>
+              </w:rPr>
               <w:t>12</w:t>
+            </w:r>
+            <w:r>
+              <w:rPr>
+                <w:noProof/>
+              </w:rPr>
               <w:fldChar w:fldCharType="end"/>
             </w:r>
           </w:hyperlink>
@@ -1536,10 +2469,40 @@
                 <w:noProof/>
               </w:rPr>
               <w:tab/>
+            </w:r>
+            <w:r>
+              <w:rPr>
+                <w:noProof/>
+              </w:rPr>
               <w:fldChar w:fldCharType="begin"/>
+            </w:r>
+            <w:r>
+              <w:rPr>
+                <w:noProof/>
+              </w:rPr>
               <w:instrText xml:space="preserve"> PAGEREF _Toc230360232 \h </w:instrText>
+            </w:r>
+            <w:r>
+              <w:rPr>
+                <w:noProof/>
+              </w:rPr>
+            </w:r>
+            <w:r>
+              <w:rPr>
+                <w:noProof/>
+              </w:rPr>
               <w:fldChar w:fldCharType="separate"/>
+            </w:r>
+            <w:r>
+              <w:rPr>
+                <w:noProof/>
+              </w:rPr>
               <w:t>13</w:t>
+            </w:r>
+            <w:r>
+              <w:rPr>
+                <w:noProof/>
+              </w:rPr>
               <w:fldChar w:fldCharType="end"/>
             </w:r>
           </w:hyperlink>
@@ -1572,10 +2535,40 @@
                 <w:noProof/>
               </w:rPr>
               <w:tab/>
+            </w:r>
+            <w:r>
+              <w:rPr>
+                <w:noProof/>
+              </w:rPr>
               <w:fldChar w:fldCharType="begin"/>
+            </w:r>
+            <w:r>
+              <w:rPr>
+                <w:noProof/>
+              </w:rPr>
               <w:instrText xml:space="preserve"> PAGEREF _Toc230360233 \h </w:instrText>
+            </w:r>
+            <w:r>
+              <w:rPr>
+                <w:noProof/>
+              </w:rPr>
+            </w:r>
+            <w:r>
+              <w:rPr>
+                <w:noProof/>
+              </w:rPr>
               <w:fldChar w:fldCharType="separate"/>
+            </w:r>
+            <w:r>
+              <w:rPr>
+                <w:noProof/>
+              </w:rPr>
               <w:t>13</w:t>
+            </w:r>
+            <w:r>
+              <w:rPr>
+                <w:noProof/>
+              </w:rPr>
               <w:fldChar w:fldCharType="end"/>
             </w:r>
           </w:hyperlink>
@@ -1608,10 +2601,40 @@
                 <w:noProof/>
               </w:rPr>
               <w:tab/>
+            </w:r>
+            <w:r>
+              <w:rPr>
+                <w:noProof/>
+              </w:rPr>
               <w:fldChar w:fldCharType="begin"/>
+            </w:r>
+            <w:r>
+              <w:rPr>
+                <w:noProof/>
+              </w:rPr>
               <w:instrText xml:space="preserve"> PAGEREF _Toc230360234 \h </w:instrText>
+            </w:r>
+            <w:r>
+              <w:rPr>
+                <w:noProof/>
+              </w:rPr>
+            </w:r>
+            <w:r>
+              <w:rPr>
+                <w:noProof/>
+              </w:rPr>
               <w:fldChar w:fldCharType="separate"/>
+            </w:r>
+            <w:r>
+              <w:rPr>
+                <w:noProof/>
+              </w:rPr>
               <w:t>13</w:t>
+            </w:r>
+            <w:r>
+              <w:rPr>
+                <w:noProof/>
+              </w:rPr>
               <w:fldChar w:fldCharType="end"/>
             </w:r>
           </w:hyperlink>
@@ -1644,10 +2667,40 @@
                 <w:noProof/>
               </w:rPr>
               <w:tab/>
+            </w:r>
+            <w:r>
+              <w:rPr>
+                <w:noProof/>
+              </w:rPr>
               <w:fldChar w:fldCharType="begin"/>
+            </w:r>
+            <w:r>
+              <w:rPr>
+                <w:noProof/>
+              </w:rPr>
               <w:instrText xml:space="preserve"> PAGEREF _Toc230360235 \h </w:instrText>
+            </w:r>
+            <w:r>
+              <w:rPr>
+                <w:noProof/>
+              </w:rPr>
+            </w:r>
+            <w:r>
+              <w:rPr>
+                <w:noProof/>
+              </w:rPr>
               <w:fldChar w:fldCharType="separate"/>
+            </w:r>
+            <w:r>
+              <w:rPr>
+                <w:noProof/>
+              </w:rPr>
               <w:t>13</w:t>
+            </w:r>
+            <w:r>
+              <w:rPr>
+                <w:noProof/>
+              </w:rPr>
               <w:fldChar w:fldCharType="end"/>
             </w:r>
           </w:hyperlink>
@@ -1680,10 +2733,40 @@
                 <w:noProof/>
               </w:rPr>
               <w:tab/>
+            </w:r>
+            <w:r>
+              <w:rPr>
+                <w:noProof/>
+              </w:rPr>
               <w:fldChar w:fldCharType="begin"/>
+            </w:r>
+            <w:r>
+              <w:rPr>
+                <w:noProof/>
+              </w:rPr>
               <w:instrText xml:space="preserve"> PAGEREF _Toc230360236 \h </w:instrText>
+            </w:r>
+            <w:r>
+              <w:rPr>
+                <w:noProof/>
+              </w:rPr>
+            </w:r>
+            <w:r>
+              <w:rPr>
+                <w:noProof/>
+              </w:rPr>
               <w:fldChar w:fldCharType="separate"/>
+            </w:r>
+            <w:r>
+              <w:rPr>
+                <w:noProof/>
+              </w:rPr>
               <w:t>13</w:t>
+            </w:r>
+            <w:r>
+              <w:rPr>
+                <w:noProof/>
+              </w:rPr>
               <w:fldChar w:fldCharType="end"/>
             </w:r>
           </w:hyperlink>
@@ -1716,10 +2799,40 @@
                 <w:noProof/>
               </w:rPr>
               <w:tab/>
+            </w:r>
+            <w:r>
+              <w:rPr>
+                <w:noProof/>
+              </w:rPr>
               <w:fldChar w:fldCharType="begin"/>
+            </w:r>
+            <w:r>
+              <w:rPr>
+                <w:noProof/>
+              </w:rPr>
               <w:instrText xml:space="preserve"> PAGEREF _Toc230360237 \h </w:instrText>
+            </w:r>
+            <w:r>
+              <w:rPr>
+                <w:noProof/>
+              </w:rPr>
+            </w:r>
+            <w:r>
+              <w:rPr>
+                <w:noProof/>
+              </w:rPr>
               <w:fldChar w:fldCharType="separate"/>
+            </w:r>
+            <w:r>
+              <w:rPr>
+                <w:noProof/>
+              </w:rPr>
               <w:t>14</w:t>
+            </w:r>
+            <w:r>
+              <w:rPr>
+                <w:noProof/>
+              </w:rPr>
               <w:fldChar w:fldCharType="end"/>
             </w:r>
           </w:hyperlink>
@@ -1752,10 +2865,40 @@
                 <w:noProof/>
               </w:rPr>
               <w:tab/>
+            </w:r>
+            <w:r>
+              <w:rPr>
+                <w:noProof/>
+              </w:rPr>
               <w:fldChar w:fldCharType="begin"/>
+            </w:r>
+            <w:r>
+              <w:rPr>
+                <w:noProof/>
+              </w:rPr>
               <w:instrText xml:space="preserve"> PAGEREF _Toc230360238 \h </w:instrText>
+            </w:r>
+            <w:r>
+              <w:rPr>
+                <w:noProof/>
+              </w:rPr>
+            </w:r>
+            <w:r>
+              <w:rPr>
+                <w:noProof/>
+              </w:rPr>
               <w:fldChar w:fldCharType="separate"/>
+            </w:r>
+            <w:r>
+              <w:rPr>
+                <w:noProof/>
+              </w:rPr>
               <w:t>14</w:t>
+            </w:r>
+            <w:r>
+              <w:rPr>
+                <w:noProof/>
+              </w:rPr>
               <w:fldChar w:fldCharType="end"/>
             </w:r>
           </w:hyperlink>
@@ -1788,10 +2931,40 @@
                 <w:noProof/>
               </w:rPr>
               <w:tab/>
+            </w:r>
+            <w:r>
+              <w:rPr>
+                <w:noProof/>
+              </w:rPr>
               <w:fldChar w:fldCharType="begin"/>
+            </w:r>
+            <w:r>
+              <w:rPr>
+                <w:noProof/>
+              </w:rPr>
               <w:instrText xml:space="preserve"> PAGEREF _Toc230360239 \h </w:instrText>
+            </w:r>
+            <w:r>
+              <w:rPr>
+                <w:noProof/>
+              </w:rPr>
+            </w:r>
+            <w:r>
+              <w:rPr>
+                <w:noProof/>
+              </w:rPr>
               <w:fldChar w:fldCharType="separate"/>
+            </w:r>
+            <w:r>
+              <w:rPr>
+                <w:noProof/>
+              </w:rPr>
               <w:t>14</w:t>
+            </w:r>
+            <w:r>
+              <w:rPr>
+                <w:noProof/>
+              </w:rPr>
               <w:fldChar w:fldCharType="end"/>
             </w:r>
           </w:hyperlink>
@@ -3771,6 +4944,7 @@
       <w:bookmarkStart w:id="14" w:name="extra"/>
       <w:bookmarkStart w:id="15" w:name="_Toc230360208"/>
       <w:r>
+        <w:lastRenderedPageBreak/>
         <w:t>Boas práticas adicionais</w:t>
       </w:r>
       <w:bookmarkEnd w:id="14"/>
@@ -3799,7 +4973,6 @@
         <w:spacing w:before="40" w:after="40"/>
       </w:pPr>
       <w:r>
-        <w:lastRenderedPageBreak/>
         <w:t>Qualquer mudanca na estrutura das colunas das planilhas exige atualizacao do codigo de parse (_parseWBS e _parseREQS).</w:t>
       </w:r>
     </w:p>
@@ -4141,6 +5314,7 @@
         <w:rPr>
           <w:sz w:val="20"/>
           <w:szCs w:val="20"/>
+          <w:lang w:val="en-US"/>
         </w:rPr>
         <w:t xml:space="preserve">Abra o </w:t>
       </w:r>
@@ -4150,15 +5324,78 @@
           <w:bCs/>
           <w:sz w:val="20"/>
           <w:szCs w:val="20"/>
+          <w:lang w:val="en-US"/>
         </w:rPr>
         <w:t>PowerShell</w:t>
+      </w:r>
+      <w:r>
+        <w:rPr>
+          <w:sz w:val="20"/>
+          <w:szCs w:val="20"/>
+          <w:lang w:val="en-US"/>
+        </w:rPr>
+        <w:t xml:space="preserve">: </w:t>
+      </w:r>
+      <w:proofErr w:type="spellStart"/>
+      <w:r>
+        <w:rPr>
+          <w:sz w:val="20"/>
+          <w:szCs w:val="20"/>
+          <w:lang w:val="en-US"/>
+        </w:rPr>
+        <w:t>tecla</w:t>
+      </w:r>
+      <w:proofErr w:type="spellEnd"/>
+      <w:r>
+        <w:rPr>
+          <w:sz w:val="20"/>
+          <w:szCs w:val="20"/>
+          <w:lang w:val="en-US"/>
+        </w:rPr>
+        <w:t xml:space="preserve"> Windows → </w:t>
+      </w:r>
+      <w:proofErr w:type="spellStart"/>
+      <w:r>
+        <w:rPr>
+          <w:sz w:val="20"/>
+          <w:szCs w:val="20"/>
+          <w:lang w:val="en-US"/>
+        </w:rPr>
+        <w:t>digite</w:t>
+      </w:r>
+      <w:proofErr w:type="spellEnd"/>
+      <w:r>
+        <w:rPr>
+          <w:sz w:val="20"/>
+          <w:szCs w:val="20"/>
+          <w:lang w:val="en-US"/>
+        </w:rPr>
+        <w:t xml:space="preserve"> “PowerShell” → </w:t>
+      </w:r>
+      <w:proofErr w:type="spellStart"/>
+      <w:r>
+        <w:rPr>
+          <w:sz w:val="20"/>
+          <w:szCs w:val="20"/>
+          <w:lang w:val="en-US"/>
+        </w:rPr>
+        <w:t>pressione</w:t>
+      </w:r>
+      <w:proofErr w:type="spellEnd"/>
+      <w:r>
+        <w:rPr>
+          <w:sz w:val="20"/>
+          <w:szCs w:val="20"/>
+          <w:lang w:val="en-US"/>
+        </w:rPr>
+        <w:t xml:space="preserve"> Enter. </w:t>
       </w:r>
       <w:r>
         <w:rPr>
           <w:sz w:val="20"/>
           <w:szCs w:val="20"/>
         </w:rPr>
-        <w:t xml:space="preserve">: tecla Windows → digite “PowerShell” → pressione Enter. Na janela que abrir, cole cada linha abaixo e pressione Enter. Se aparecer um número de versão, está instalado corretamente.</w:t>
+        <w:t>Na janela que abrir, cole cada linha abaixo e pressione Enter. Se aparecer um número de versão, está instalado corretamente.</w:t>
       </w:r>
     </w:p>
     <w:tbl>
@@ -4389,7 +5626,7 @@
           <w:sz w:val="20"/>
           <w:szCs w:val="20"/>
         </w:rPr>
-        <w:t xml:space="preserve">Abra o PowerShell: tecla Windows → digite “PowerShell” → Enter.</w:t>
+        <w:t>Abra o PowerShell: tecla Windows → digite “PowerShell” → Enter.</w:t>
       </w:r>
     </w:p>
     <w:p>
@@ -4410,7 +5647,7 @@
           <w:sz w:val="20"/>
           <w:szCs w:val="20"/>
         </w:rPr>
-        <w:t xml:space="preserve">Navegue até a pasta onde vai salvar o projeto (ajuste "SEU_NOME" para o seu usuário):</w:t>
+        <w:t>Navegue até a pasta onde vai salvar o projeto (ajuste "SEU_NOME" para o seu usuário):</w:t>
       </w:r>
     </w:p>
     <w:tbl>
@@ -4426,6 +5663,7 @@
           <w:left w:w="10" w:type="dxa"/>
           <w:right w:w="10" w:type="dxa"/>
         </w:tblCellMar>
+        <w:tblLook w:val="04A0" w:firstRow="1" w:lastRow="0" w:firstColumn="1" w:lastColumn="0" w:noHBand="0" w:noVBand="1"/>
       </w:tblPr>
       <w:tblGrid>
         <w:gridCol w:w="9026"/>
@@ -4579,7 +5817,7 @@
         <w:spacing w:before="60" w:after="60"/>
       </w:pPr>
       <w:r>
-        <w:t xml:space="preserve">Após o clone, tudo está pronto diretamente em maz-dashboard — sem pasta de ambiente separada. A estrutura é:</w:t>
+        <w:t>Após o clone, tudo está pronto diretamente em maz-dashboard — sem pasta de ambiente separada. A estrutura é:</w:t>
       </w:r>
     </w:p>
     <w:tbl>
@@ -4623,10 +5861,109 @@
           <w:p>
             <w:pPr>
               <w:spacing w:before="10" w:after="10"/>
+            </w:pPr>
+            <w:r>
+              <w:rPr>
+                <w:rFonts w:ascii="Courier New" w:eastAsia="Courier New" w:hAnsi="Courier New" w:cs="Courier New"/>
+                <w:color w:val="2D2D2D"/>
+                <w:sz w:val="18"/>
+                <w:szCs w:val="18"/>
+              </w:rPr>
+              <w:t>GitHub\</w:t>
+            </w:r>
+          </w:p>
+          <w:p>
+            <w:pPr>
+              <w:spacing w:before="10" w:after="10"/>
+            </w:pPr>
+            <w:r>
+              <w:rPr>
+                <w:rFonts w:ascii="Courier New" w:eastAsia="Courier New" w:hAnsi="Courier New" w:cs="Courier New"/>
+                <w:color w:val="2D2D2D"/>
+                <w:sz w:val="18"/>
+                <w:szCs w:val="18"/>
+              </w:rPr>
+              <w:t xml:space="preserve">  </w:t>
+            </w:r>
+            <w:proofErr w:type="spellStart"/>
+            <w:r>
+              <w:rPr>
+                <w:rFonts w:ascii="Courier New" w:eastAsia="Courier New" w:hAnsi="Courier New" w:cs="Courier New"/>
+                <w:color w:val="2D2D2D"/>
+                <w:sz w:val="18"/>
+                <w:szCs w:val="18"/>
+              </w:rPr>
+              <w:t>maz</w:t>
+            </w:r>
+            <w:proofErr w:type="spellEnd"/>
+            <w:r>
+              <w:rPr>
+                <w:rFonts w:ascii="Courier New" w:eastAsia="Courier New" w:hAnsi="Courier New" w:cs="Courier New"/>
+                <w:color w:val="2D2D2D"/>
+                <w:sz w:val="18"/>
+                <w:szCs w:val="18"/>
+              </w:rPr>
+              <w:t>-dashboard\                 &lt;- PASTA ÚNICA (editar, testar, publicar)</w:t>
+            </w:r>
+          </w:p>
+          <w:p>
+            <w:pPr>
+              <w:spacing w:before="10" w:after="10"/>
+            </w:pPr>
+            <w:r>
+              <w:rPr>
+                <w:rFonts w:ascii="Courier New" w:eastAsia="Courier New" w:hAnsi="Courier New" w:cs="Courier New"/>
+                <w:color w:val="2D2D2D"/>
+                <w:sz w:val="18"/>
+                <w:szCs w:val="18"/>
+              </w:rPr>
+              <w:t xml:space="preserve">    index.html</w:t>
+            </w:r>
+          </w:p>
+          <w:p>
+            <w:pPr>
+              <w:spacing w:before="10" w:after="10"/>
+            </w:pPr>
+            <w:r>
+              <w:rPr>
+                <w:rFonts w:ascii="Courier New" w:eastAsia="Courier New" w:hAnsi="Courier New" w:cs="Courier New"/>
+                <w:color w:val="2D2D2D"/>
+                <w:sz w:val="18"/>
+                <w:szCs w:val="18"/>
+              </w:rPr>
+              <w:t xml:space="preserve">    mobile.html</w:t>
+            </w:r>
+          </w:p>
+          <w:p>
+            <w:pPr>
+              <w:spacing w:before="10" w:after="10"/>
+            </w:pPr>
+            <w:r>
+              <w:rPr>
+                <w:rFonts w:ascii="Courier New" w:eastAsia="Courier New" w:hAnsi="Courier New" w:cs="Courier New"/>
+                <w:color w:val="2D2D2D"/>
+                <w:sz w:val="18"/>
+                <w:szCs w:val="18"/>
+              </w:rPr>
+              <w:t xml:space="preserve">    SERVE_DASHBOARD.bat</w:t>
+            </w:r>
+          </w:p>
+          <w:p>
+            <w:pPr>
+              <w:spacing w:before="10" w:after="10"/>
               <w:rPr>
                 <w:lang w:val="en-US"/>
               </w:rPr>
             </w:pPr>
+            <w:r>
+              <w:rPr>
+                <w:rFonts w:ascii="Courier New" w:eastAsia="Courier New" w:hAnsi="Courier New" w:cs="Courier New"/>
+                <w:color w:val="2D2D2D"/>
+                <w:sz w:val="18"/>
+                <w:szCs w:val="18"/>
+              </w:rPr>
+              <w:t xml:space="preserve">    </w:t>
+            </w:r>
             <w:r>
               <w:rPr>
                 <w:rFonts w:ascii="Courier New" w:eastAsia="Courier New" w:hAnsi="Courier New" w:cs="Courier New"/>
@@ -4635,7 +5972,7 @@
                 <w:szCs w:val="18"/>
                 <w:lang w:val="en-US"/>
               </w:rPr>
-              <w:t>GitHub\</w:t>
+              <w:t>CLAUDE.md</w:t>
             </w:r>
           </w:p>
           <w:p>
@@ -4653,7 +5990,7 @@
                 <w:szCs w:val="18"/>
                 <w:lang w:val="en-US"/>
               </w:rPr>
-              <w:t xml:space="preserve">  maz-dashboard\                 &lt;- PASTA ÚNICA (editar, testar, publicar)</w:t>
+              <w:t xml:space="preserve">    doc-sync\                    &lt;- skill doc-sync + contexto</w:t>
             </w:r>
           </w:p>
           <w:p>
@@ -4662,6 +5999,11 @@
               <w:rPr>
                 <w:lang w:val="en-US"/>
               </w:rPr>
+            </w:pPr>
+          </w:p>
+          <w:p>
+            <w:pPr>
+              <w:spacing w:before="10" w:after="10"/>
             </w:pPr>
             <w:r>
               <w:rPr>
@@ -4671,16 +6013,101 @@
                 <w:szCs w:val="18"/>
                 <w:lang w:val="en-US"/>
               </w:rPr>
-              <w:t xml:space="preserve">    index.html</w:t>
-            </w:r>
+              <w:t xml:space="preserve">    </w:t>
+            </w:r>
+            <w:r>
+              <w:rPr>
+                <w:rFonts w:ascii="Courier New" w:eastAsia="Courier New" w:hAnsi="Courier New" w:cs="Courier New"/>
+                <w:color w:val="2D2D2D"/>
+                <w:sz w:val="18"/>
+                <w:szCs w:val="18"/>
+              </w:rPr>
+              <w:t xml:space="preserve">Manual\                      &lt;- documentação </w:t>
+            </w:r>
+            <w:proofErr w:type="spellStart"/>
+            <w:r>
+              <w:rPr>
+                <w:rFonts w:ascii="Courier New" w:eastAsia="Courier New" w:hAnsi="Courier New" w:cs="Courier New"/>
+                <w:color w:val="2D2D2D"/>
+                <w:sz w:val="18"/>
+                <w:szCs w:val="18"/>
+              </w:rPr>
+              <w:t>versionada</w:t>
+            </w:r>
+            <w:proofErr w:type="spellEnd"/>
           </w:p>
           <w:p>
             <w:pPr>
               <w:spacing w:before="10" w:after="10"/>
+            </w:pPr>
+            <w:r>
+              <w:rPr>
+                <w:rFonts w:ascii="Courier New" w:eastAsia="Courier New" w:hAnsi="Courier New" w:cs="Courier New"/>
+                <w:color w:val="2D2D2D"/>
+                <w:sz w:val="18"/>
+                <w:szCs w:val="18"/>
+              </w:rPr>
+              <w:t xml:space="preserve">    index.html</w:t>
+            </w:r>
+          </w:p>
+          <w:p>
+            <w:pPr>
+              <w:spacing w:before="10" w:after="10"/>
+            </w:pPr>
+            <w:r>
+              <w:rPr>
+                <w:rFonts w:ascii="Courier New" w:eastAsia="Courier New" w:hAnsi="Courier New" w:cs="Courier New"/>
+                <w:color w:val="2D2D2D"/>
+                <w:sz w:val="18"/>
+                <w:szCs w:val="18"/>
+              </w:rPr>
+              <w:t xml:space="preserve">    mobile.html</w:t>
+            </w:r>
+          </w:p>
+          <w:p>
+            <w:pPr>
+              <w:spacing w:before="10" w:after="10"/>
+            </w:pPr>
+            <w:r>
+              <w:rPr>
+                <w:rFonts w:ascii="Courier New" w:eastAsia="Courier New" w:hAnsi="Courier New" w:cs="Courier New"/>
+                <w:color w:val="2D2D2D"/>
+                <w:sz w:val="18"/>
+                <w:szCs w:val="18"/>
+              </w:rPr>
+              <w:t xml:space="preserve">    00. Apoio\                   &lt;- logos e banners</w:t>
+            </w:r>
+          </w:p>
+          <w:p>
+            <w:pPr>
+              <w:spacing w:before="10" w:after="10"/>
+            </w:pPr>
+            <w:r>
+              <w:rPr>
+                <w:rFonts w:ascii="Courier New" w:eastAsia="Courier New" w:hAnsi="Courier New" w:cs="Courier New"/>
+                <w:color w:val="2D2D2D"/>
+                <w:sz w:val="18"/>
+                <w:szCs w:val="18"/>
+              </w:rPr>
+              <w:t xml:space="preserve">    ONBOARDING.md                &lt;- leia antes de trabalhar</w:t>
+            </w:r>
+          </w:p>
+          <w:p>
+            <w:pPr>
+              <w:spacing w:before="10" w:after="10"/>
               <w:rPr>
                 <w:lang w:val="en-US"/>
               </w:rPr>
             </w:pPr>
+            <w:r>
+              <w:rPr>
+                <w:rFonts w:ascii="Courier New" w:eastAsia="Courier New" w:hAnsi="Courier New" w:cs="Courier New"/>
+                <w:color w:val="2D2D2D"/>
+                <w:sz w:val="18"/>
+                <w:szCs w:val="18"/>
+              </w:rPr>
+              <w:t xml:space="preserve">    </w:t>
+            </w:r>
             <w:r>
               <w:rPr>
                 <w:rFonts w:ascii="Courier New" w:eastAsia="Courier New" w:hAnsi="Courier New" w:cs="Courier New"/>
@@ -4689,7 +6116,7 @@
                 <w:szCs w:val="18"/>
                 <w:lang w:val="en-US"/>
               </w:rPr>
-              <w:t xml:space="preserve">    mobile.html</w:t>
+              <w:t>CLAUDE.md</w:t>
             </w:r>
           </w:p>
           <w:p>
@@ -4699,16 +6126,6 @@
                 <w:lang w:val="en-US"/>
               </w:rPr>
             </w:pPr>
-            <w:r>
-              <w:rPr>
-                <w:rFonts w:ascii="Courier New" w:eastAsia="Courier New" w:hAnsi="Courier New" w:cs="Courier New"/>
-                <w:color w:val="2D2D2D"/>
-                <w:sz w:val="18"/>
-                <w:szCs w:val="18"/>
-                <w:lang w:val="en-US"/>
-              </w:rPr>
-              <w:t xml:space="preserve">    SERVE_DASHBOARD.bat</w:t>
-            </w:r>
           </w:p>
           <w:p>
             <w:pPr>
@@ -4717,196 +6134,6 @@
                 <w:lang w:val="en-US"/>
               </w:rPr>
             </w:pPr>
-            <w:r>
-              <w:rPr>
-                <w:rFonts w:ascii="Courier New" w:eastAsia="Courier New" w:hAnsi="Courier New" w:cs="Courier New"/>
-                <w:color w:val="2D2D2D"/>
-                <w:sz w:val="18"/>
-                <w:szCs w:val="18"/>
-                <w:lang w:val="en-US"/>
-              </w:rPr>
-              <w:t xml:space="preserve">    CLAUDE.md</w:t>
-            </w:r>
-          </w:p>
-          <w:p>
-            <w:pPr>
-              <w:spacing w:before="10" w:after="10"/>
-              <w:rPr>
-                <w:lang w:val="en-US"/>
-              </w:rPr>
-            </w:pPr>
-            <w:r>
-              <w:rPr>
-                <w:rFonts w:ascii="Courier New" w:eastAsia="Courier New" w:hAnsi="Courier New" w:cs="Courier New"/>
-                <w:color w:val="2D2D2D"/>
-                <w:sz w:val="18"/>
-                <w:szCs w:val="18"/>
-                <w:lang w:val="en-US"/>
-              </w:rPr>
-              <w:t xml:space="preserve">    doc-sync\                    &lt;- skill doc-sync + contexto</w:t>
-            </w:r>
-          </w:p>
-          <w:p>
-            <w:pPr>
-              <w:spacing w:before="10" w:after="10"/>
-              <w:rPr>
-                <w:lang w:val="en-US"/>
-              </w:rPr>
-            </w:pPr>
-            <w:r>
-              <w:rPr>
-                <w:rFonts w:ascii="Courier New" w:eastAsia="Courier New" w:hAnsi="Courier New" w:cs="Courier New"/>
-                <w:color w:val="2D2D2D"/>
-                <w:sz w:val="18"/>
-                <w:szCs w:val="18"/>
-                <w:lang w:val="en-US"/>
-              </w:rPr>
-              <w:t xml:space="preserve"/>
-            </w:r>
-          </w:p>
-          <w:p>
-            <w:pPr>
-              <w:spacing w:before="10" w:after="10"/>
-              <w:rPr>
-                <w:lang w:val="en-US"/>
-              </w:rPr>
-            </w:pPr>
-            <w:r>
-              <w:rPr>
-                <w:rFonts w:ascii="Courier New" w:eastAsia="Courier New" w:hAnsi="Courier New" w:cs="Courier New"/>
-                <w:color w:val="2D2D2D"/>
-                <w:sz w:val="18"/>
-                <w:szCs w:val="18"/>
-                <w:lang w:val="en-US"/>
-              </w:rPr>
-              <w:t xml:space="preserve">    Manual\                      &lt;- documentação versionada</w:t>
-            </w:r>
-          </w:p>
-          <w:p>
-            <w:pPr>
-              <w:spacing w:before="10" w:after="10"/>
-              <w:rPr>
-                <w:lang w:val="en-US"/>
-              </w:rPr>
-            </w:pPr>
-            <w:r>
-              <w:rPr>
-                <w:rFonts w:ascii="Courier New" w:eastAsia="Courier New" w:hAnsi="Courier New" w:cs="Courier New"/>
-                <w:color w:val="2D2D2D"/>
-                <w:sz w:val="18"/>
-                <w:szCs w:val="18"/>
-                <w:lang w:val="en-US"/>
-              </w:rPr>
-              <w:t xml:space="preserve">    index.html</w:t>
-            </w:r>
-          </w:p>
-          <w:p>
-            <w:pPr>
-              <w:spacing w:before="10" w:after="10"/>
-              <w:rPr>
-                <w:lang w:val="en-US"/>
-              </w:rPr>
-            </w:pPr>
-            <w:r>
-              <w:rPr>
-                <w:rFonts w:ascii="Courier New" w:eastAsia="Courier New" w:hAnsi="Courier New" w:cs="Courier New"/>
-                <w:color w:val="2D2D2D"/>
-                <w:sz w:val="18"/>
-                <w:szCs w:val="18"/>
-                <w:lang w:val="en-US"/>
-              </w:rPr>
-              <w:t xml:space="preserve">    mobile.html</w:t>
-            </w:r>
-          </w:p>
-          <w:p>
-            <w:pPr>
-              <w:spacing w:before="10" w:after="10"/>
-              <w:rPr>
-                <w:lang w:val="en-US"/>
-              </w:rPr>
-            </w:pPr>
-            <w:r>
-              <w:rPr>
-                <w:rFonts w:ascii="Courier New" w:eastAsia="Courier New" w:hAnsi="Courier New" w:cs="Courier New"/>
-                <w:color w:val="2D2D2D"/>
-                <w:sz w:val="18"/>
-                <w:szCs w:val="18"/>
-                <w:lang w:val="en-US"/>
-              </w:rPr>
-              <w:t xml:space="preserve">    00. Apoio\                   &lt;- logos e banners</w:t>
-            </w:r>
-          </w:p>
-          <w:p>
-            <w:pPr>
-              <w:spacing w:before="10" w:after="10"/>
-              <w:rPr>
-                <w:lang w:val="en-US"/>
-              </w:rPr>
-            </w:pPr>
-            <w:r>
-              <w:rPr>
-                <w:rFonts w:ascii="Courier New" w:eastAsia="Courier New" w:hAnsi="Courier New" w:cs="Courier New"/>
-                <w:color w:val="2D2D2D"/>
-                <w:sz w:val="18"/>
-                <w:szCs w:val="18"/>
-                <w:lang w:val="en-US"/>
-              </w:rPr>
-              <w:t xml:space="preserve">    ONBOARDING.md                &lt;- leia antes de trabalhar</w:t>
-            </w:r>
-          </w:p>
-          <w:p>
-            <w:pPr>
-              <w:spacing w:before="10" w:after="10"/>
-              <w:rPr>
-                <w:lang w:val="en-US"/>
-              </w:rPr>
-            </w:pPr>
-            <w:r>
-              <w:rPr>
-                <w:rFonts w:ascii="Courier New" w:eastAsia="Courier New" w:hAnsi="Courier New" w:cs="Courier New"/>
-                <w:color w:val="2D2D2D"/>
-                <w:sz w:val="18"/>
-                <w:szCs w:val="18"/>
-                <w:lang w:val="en-US"/>
-              </w:rPr>
-              <w:t xml:space="preserve">    CLAUDE.md</w:t>
-            </w:r>
-          </w:p>
-          <w:p>
-            <w:pPr>
-              <w:spacing w:before="10" w:after="10"/>
-              <w:rPr>
-                <w:lang w:val="en-US"/>
-              </w:rPr>
-            </w:pPr>
-            <w:r>
-              <w:rPr>
-                <w:rFonts w:ascii="Courier New" w:eastAsia="Courier New" w:hAnsi="Courier New" w:cs="Courier New"/>
-                <w:color w:val="2D2D2D"/>
-                <w:sz w:val="18"/>
-                <w:szCs w:val="18"/>
-                <w:lang w:val="en-US"/>
-              </w:rPr>
-              <w:t xml:space="preserve"/>
-            </w:r>
-          </w:p>
-          <w:p>
-            <w:pPr>
-              <w:spacing w:before="10" w:after="10"/>
-              <w:rPr>
-                <w:lang w:val="en-US"/>
-              </w:rPr>
-            </w:pPr>
-            <w:r>
-              <w:rPr>
-                <w:rFonts w:ascii="Courier New" w:eastAsia="Courier New" w:hAnsi="Courier New" w:cs="Courier New"/>
-                <w:color w:val="2D2D2D"/>
-                <w:sz w:val="18"/>
-                <w:szCs w:val="18"/>
-                <w:lang w:val="en-US"/>
-              </w:rPr>
-              <w:t xml:space="preserve"/>
-            </w:r>
           </w:p>
         </w:tc>
       </w:tr>
@@ -4972,7 +6199,6 @@
         <w:spacing w:before="60" w:after="60"/>
       </w:pPr>
       <w:r>
-        <w:lastRenderedPageBreak/>
         <w:t>O responsável anterior precisa te adicionar como colaborador:</w:t>
       </w:r>
     </w:p>
@@ -6072,7 +7298,7 @@
           <w:sz w:val="20"/>
           <w:szCs w:val="20"/>
         </w:rPr>
-        <w:t xml:space="preserve">peça em linguagem natural — “commita e sobe para produção com a mensagem: [descrição]”. O Claude executa os 3 comandos abaixo por você.</w:t>
+        <w:t>peça em linguagem natural — “commita e sobe para produção com a mensagem: [descrição]”. O Claude executa os 3 comandos abaixo por você.</w:t>
       </w:r>
     </w:p>
     <w:p>
@@ -6214,6 +7440,7 @@
         <w:spacing w:before="60" w:after="60"/>
       </w:pPr>
       <w:r>
+        <w:lastRenderedPageBreak/>
         <w:t>Aguardar ~2 minutos, depois confirmar em:</w:t>
       </w:r>
     </w:p>
@@ -6282,7 +7509,6 @@
         <w:spacing w:before="60" w:after="60"/>
       </w:pPr>
       <w:r>
-        <w:lastRenderedPageBreak/>
         <w:t>Fazer hard refresh (Ctrl+Shift+R) no GitHub Pages para confirmar.</w:t>
       </w:r>
     </w:p>
@@ -10499,7 +11725,6 @@
         <w:gridCol w:w="6026"/>
       </w:tblGrid>
       <w:tr>
-        <w:trPr/>
         <w:tc>
           <w:tcPr>
             <w:tcW w:w="3000" w:type="dxa"/>
@@ -10598,6 +11823,7 @@
                 <w:sz w:val="18"/>
                 <w:szCs w:val="18"/>
               </w:rPr>
+              <w:lastRenderedPageBreak/>
               <w:t>grupoHasResp(grupo, resp)</w:t>
             </w:r>
           </w:p>
@@ -10841,13 +12067,13 @@
           <w:left w:w="120" w:type="dxa"/>
           <w:right w:w="120" w:type="dxa"/>
         </w:tblCellMar>
+        <w:tblLook w:val="04A0" w:firstRow="1" w:lastRow="0" w:firstColumn="1" w:lastColumn="0" w:noHBand="0" w:noVBand="1"/>
       </w:tblPr>
       <w:tblGrid>
         <w:gridCol w:w="3500"/>
         <w:gridCol w:w="5526"/>
       </w:tblGrid>
       <w:tr>
-        <w:trPr/>
         <w:tc>
           <w:tcPr>
             <w:tcW w:w="3500" w:type="dxa"/>
@@ -11116,9 +12342,9 @@
       </w:pPr>
       <w:r>
         <w:rPr>
+          <w:rFonts w:ascii="Courier New" w:hAnsi="Courier New"/>
           <w:b/>
           <w:bCs/>
-          <w:rFonts w:ascii="Courier New" w:hAnsi="Courier New"/>
           <w:color w:val="1F4E79"/>
           <w:sz w:val="18"/>
           <w:szCs w:val="18"/>
@@ -11130,7 +12356,7 @@
           <w:sz w:val="20"/>
           <w:szCs w:val="20"/>
         </w:rPr>
-        <w:t xml:space="preserve">— dropdown multi-select de fornecedor, gerado a partir da coluna G (índice 6) do sheet REQS. Itens sem fornecedor agrupados como “Sem Fornecedor”.</w:t>
+        <w:t>— dropdown multi-select de fornecedor, gerado a partir da coluna G (índice 6) do sheet REQS. Itens sem fornecedor agrupados como “Sem Fornecedor”.</w:t>
       </w:r>
     </w:p>
     <w:p>
@@ -11144,9 +12370,9 @@
       </w:pPr>
       <w:r>
         <w:rPr>
+          <w:rFonts w:ascii="Courier New" w:hAnsi="Courier New"/>
           <w:b/>
           <w:bCs/>
-          <w:rFonts w:ascii="Courier New" w:hAnsi="Courier New"/>
           <w:color w:val="1F4E79"/>
           <w:sz w:val="18"/>
           <w:szCs w:val="18"/>
@@ -11617,7 +12843,7 @@
                 <w:sz w:val="20"/>
                 <w:szCs w:val="20"/>
               </w:rPr>
-              <w:t xml:space="preserve">Os índices de _parseREQS foram corrigidos (commit 7662590). Índices corretos: r[0]=N.Req, r[1]=Comprador, r[3]=Prioridade, r[4]=Descrição, r[5]=Status, r[6]=Fornecedor, r[12]=Data prevista. Se os KPIs de Requi­sições aparecerem zerados, verificar primeiro se o mapeamento de colunas está correto.</w:t>
+              <w:t>Os índices de _parseREQS foram corrigidos (commit 7662590). Índices corretos: r[0]=N.Req, r[1]=Comprador, r[3]=Prioridade, r[4]=Descrição, r[5]=Status, r[6]=Fornecedor, r[12]=Data prevista. Se os KPIs de Requi­sições aparecerem zerados, verificar primeiro se o mapeamento de colunas está correto.</w:t>
             </w:r>
           </w:p>
         </w:tc>
@@ -11635,11 +12861,11 @@
           <w:bottom w:val="single" w:sz="8" w:space="6" w:color="2E75B6"/>
         </w:pBdr>
       </w:pPr>
-      <w:bookmarkStart w:id="90" w:name="sec9"/>
+      <w:bookmarkStart w:id="84" w:name="sec9"/>
       <w:r>
         <w:t>10. Skills disponíveis no repositório</w:t>
       </w:r>
-      <w:bookmarkEnd w:id="90"/>
+      <w:bookmarkEnd w:id="84"/>
     </w:p>
     <w:p>
       <w:r>
@@ -11675,7 +12901,7 @@
           <w:b/>
           <w:bCs/>
         </w:rPr>
-        <w:t xml:space="preserve">Como acionar manualmente (escrever em linguagem natural no Claude Code):</w:t>
+        <w:t>Como acionar manualmente (escrever em linguagem natural no Claude Code):</w:t>
       </w:r>
     </w:p>
     <w:tbl>
@@ -11931,6 +13157,7 @@
           <w:insideH w:val="single" w:sz="4" w:space="0" w:color="CCCCCC"/>
           <w:insideV w:val="single" w:sz="4" w:space="0" w:color="CCCCCC"/>
         </w:tblBorders>
+        <w:tblLook w:val="04A0" w:firstRow="1" w:lastRow="0" w:firstColumn="1" w:lastColumn="0" w:noHBand="0" w:noVBand="1"/>
       </w:tblPr>
       <w:tblGrid>
         <w:gridCol w:w="500"/>
@@ -12110,7 +13337,7 @@
         <w:t>doc-sync</w:t>
       </w:r>
       <w:r>
-        <w:t xml:space="preserve">. A skill identifica automaticamente o que mudou, explica em linguagem simples e pede sua aprovação antes de alterar qualquer documento.</w:t>
+        <w:t>. A skill identifica automaticamente o que mudou, explica em linguagem simples e pede sua aprovação antes de alterar qualquer documento.</w:t>
       </w:r>
     </w:p>
     <w:p>
@@ -12123,7 +13350,8 @@
     </w:p>
     <w:p>
       <w:r>
-        <w:t xml:space="preserve">A skill e seu contexto vivem no próprio repo GitHub, garantindo portabilidade para qualquer dev futuro:</w:t>
+        <w:lastRenderedPageBreak/>
+        <w:t>A skill e seu contexto vivem no próprio repo GitHub, garantindo portabilidade para qualquer dev futuro:</w:t>
       </w:r>
     </w:p>
     <w:tbl>
@@ -12137,6 +13365,7 @@
           <w:insideH w:val="single" w:sz="4" w:space="0" w:color="CCCCCC"/>
           <w:insideV w:val="single" w:sz="4" w:space="0" w:color="CCCCCC"/>
         </w:tblBorders>
+        <w:tblLook w:val="04A0" w:firstRow="1" w:lastRow="0" w:firstColumn="1" w:lastColumn="0" w:noHBand="0" w:noVBand="1"/>
       </w:tblPr>
       <w:tblGrid>
         <w:gridCol w:w="3500"/>
@@ -12272,9 +13501,15 @@
             </w:tcMar>
           </w:tcPr>
           <w:p>
+            <w:pPr>
+              <w:rPr>
+                <w:lang w:val="en-US"/>
+              </w:rPr>
+            </w:pPr>
             <w:r>
               <w:rPr>
                 <w:b/>
+                <w:lang w:val="en-US"/>
               </w:rPr>
               <w:t>doc-sync\_snapshot_index.html</w:t>
             </w:r>
@@ -12291,8 +13526,21 @@
             </w:tcMar>
           </w:tcPr>
           <w:p>
-            <w:r>
-              <w:t>Última versão do dashboard documentada (linha de base para o próximo diff)</w:t>
+            <w:proofErr w:type="spellStart"/>
+            <w:r>
+              <w:t>Última</w:t>
+            </w:r>
+            <w:proofErr w:type="spellEnd"/>
+            <w:r>
+              <w:t xml:space="preserve"> </w:t>
+            </w:r>
+            <w:proofErr w:type="spellStart"/>
+            <w:r>
+              <w:t>versão</w:t>
+            </w:r>
+            <w:proofErr w:type="spellEnd"/>
+            <w:r>
+              <w:t xml:space="preserve"> do dashboard documentada (linha de base para o próximo diff)</w:t>
             </w:r>
           </w:p>
         </w:tc>

</xml_diff>